<commit_message>
Upgrade code logic: anti-duplicate subject, fast batch processing, unified New-VnDoc (vn-officecli/templates/cong_van_mau.docx)
</commit_message>
<xml_diff>
--- a/vn-officecli/templates/cong_van_mau.docx
+++ b/vn-officecli/templates/cong_van_mau.docx
@@ -46,6 +46,7 @@
           </w:p>
           <w:p>
             <w:pPr>
+              <w:spacing w:before="120"/>
               <w:jc w:val="center"/>
             </w:pPr>
             <w:r>
@@ -53,7 +54,7 @@
                 <w:i/>
                 <w:sz w:val="24"/>
               </w:rPr>
-              <w:t xml:space="preserve">V/v: V/v phối hợp triển khai công tác chuyển đổi số và chuẩn hóa văn bản</w:t>
+              <w:t xml:space="preserve">V/v: phối hợp triển khai công tác chuyển đổi số và chuẩn hóa văn bản</w:t>
             </w:r>
           </w:p>
         </w:tc>
@@ -112,7 +113,7 @@
     </w:p>
     <w:p>
       <w:pPr>
-        <w:spacing w:before="40" w:after="80" w:line="312" w:lineRule="auto"/>
+        <w:spacing w:before="60" w:after="120" w:line="312" w:lineRule="auto"/>
         <w:ind w:firstLine="709"/>
         <w:jc w:val="both"/>
       </w:pPr>
@@ -125,33 +126,33 @@
     </w:p>
     <w:p>
       <w:pPr>
-        <w:spacing w:before="40" w:after="120" w:line="312" w:lineRule="auto"/>
-        <w:ind w:firstLine="709"/>
-        <w:jc w:val="both"/>
-      </w:pPr>
-      <w:r>
-        <w:rPr>
-          <w:sz w:val="26"/>
-        </w:rPr>
-        <w:t xml:space="preserve">- Nhằm đảm bảo tính đồng bộ, chuyên nghiệp và nâng cao hiệu quả công tác văn thư lưu trữ trên toàn hệ thống Tập đoàn và các đơn vị thành viên;</w:t>
-      </w:r>
-    </w:p>
-    <w:p>
-      <w:pPr>
-        <w:spacing w:before="80" w:after="120" w:line="312" w:lineRule="auto"/>
-        <w:ind w:firstLine="709"/>
-        <w:jc w:val="both"/>
-      </w:pPr>
-      <w:r>
-        <w:rPr>
-          <w:sz w:val="26"/>
-        </w:rPr>
-        <w:t xml:space="preserve">Tổng Giám đốc Tập đoàn Hoàn Cầu đề nghị Thủ trưởng các Đơn vị trực thuộc và Giám đốc các Công ty thành viên tập trung triển khai thực hiện các nội dung sau:</w:t>
-      </w:r>
-    </w:p>
-    <w:p>
-      <w:pPr>
-        <w:spacing w:before="60" w:after="80" w:line="312" w:lineRule="auto"/>
+        <w:spacing w:before="60" w:after="120" w:line="312" w:lineRule="auto"/>
+        <w:ind w:firstLine="709"/>
+        <w:jc w:val="both"/>
+      </w:pPr>
+      <w:r>
+        <w:rPr>
+          <w:sz w:val="26"/>
+        </w:rPr>
+        <w:t xml:space="preserve">- Nhằm đảm bảo tính thống nhất, nâng cao tính chuyên nghiệp và hiệu quả trong công tác soạn thảo, quản lý văn thư trên toàn hệ thống Tập đoàn và các đơn vị thành viên;</w:t>
+      </w:r>
+    </w:p>
+    <w:p>
+      <w:pPr>
+        <w:spacing w:before="60" w:after="120" w:line="312" w:lineRule="auto"/>
+        <w:ind w:firstLine="709"/>
+        <w:jc w:val="both"/>
+      </w:pPr>
+      <w:r>
+        <w:rPr>
+          <w:sz w:val="26"/>
+        </w:rPr>
+        <w:t xml:space="preserve">Tổng Giám đốc Tập đoàn Hoàn Cầu đề nghị Thủ trưởng các Đơn vị trực thuộc và Giám đốc các Công ty thành viên tập trung chỉ đạo triển khai thực hiện các nội dung sau:</w:t>
+      </w:r>
+    </w:p>
+    <w:p>
+      <w:pPr>
+        <w:spacing w:before="60" w:after="120" w:line="312" w:lineRule="auto"/>
         <w:ind w:firstLine="709"/>
         <w:jc w:val="both"/>
       </w:pPr>
@@ -164,7 +165,7 @@
     </w:p>
     <w:p>
       <w:pPr>
-        <w:spacing w:before="60" w:after="80" w:line="312" w:lineRule="auto"/>
+        <w:spacing w:before="60" w:after="120" w:line="312" w:lineRule="auto"/>
         <w:ind w:firstLine="709"/>
         <w:jc w:val="both"/>
       </w:pPr>
@@ -190,7 +191,7 @@
     </w:p>
     <w:p>
       <w:pPr>
-        <w:spacing w:before="80" w:after="400" w:line="312" w:lineRule="auto"/>
+        <w:spacing w:before="60" w:after="400" w:line="312" w:lineRule="auto"/>
         <w:ind w:firstLine="709"/>
         <w:jc w:val="both"/>
       </w:pPr>

</xml_diff>